<commit_message>
Add quantized GPT-2 energy profiling experiments and comparison
</commit_message>
<xml_diff>
--- a/comparison/GPT-2 vs Open Source LLMs Energy Comparison Report.docx
+++ b/comparison/GPT-2 vs Open Source LLMs Energy Comparison Report.docx
@@ -238,7 +238,6 @@
         </w:rPr>
         <w:t xml:space="preserve">, </w:t>
       </w:r>
-      <w:proofErr w:type="spellStart"/>
       <w:r>
         <w:rPr>
           <w:rFonts w:ascii="Times New Roman" w:eastAsiaTheme="majorEastAsia" w:hAnsi="Times New Roman" w:cs="Times New Roman"/>
@@ -250,7 +249,6 @@
         </w:rPr>
         <w:t>TinyLlama</w:t>
       </w:r>
-      <w:proofErr w:type="spellEnd"/>
       <w:r>
         <w:rPr>
           <w:rFonts w:ascii="Times New Roman" w:eastAsiaTheme="majorEastAsia" w:hAnsi="Times New Roman" w:cs="Times New Roman"/>
@@ -377,9 +375,8 @@
           <w:sz w:val="40"/>
           <w:szCs w:val="40"/>
         </w:rPr>
-        <w:t xml:space="preserve"> Dr. </w:t>
-      </w:r>
-      <w:proofErr w:type="spellStart"/>
+        <w:t xml:space="preserve"> Dr. Me</w:t>
+      </w:r>
       <w:r>
         <w:rPr>
           <w:rFonts w:ascii="Times New Roman" w:eastAsiaTheme="majorEastAsia" w:hAnsi="Times New Roman" w:cs="Times New Roman"/>
@@ -389,9 +386,8 @@
           <w:sz w:val="40"/>
           <w:szCs w:val="40"/>
         </w:rPr>
-        <w:t>Mewish</w:t>
-      </w:r>
-      <w:proofErr w:type="spellEnd"/>
+        <w:t>h</w:t>
+      </w:r>
       <w:r>
         <w:rPr>
           <w:rFonts w:ascii="Times New Roman" w:eastAsiaTheme="majorEastAsia" w:hAnsi="Times New Roman" w:cs="Times New Roman"/>
@@ -401,7 +397,7 @@
           <w:sz w:val="40"/>
           <w:szCs w:val="40"/>
         </w:rPr>
-        <w:t xml:space="preserve"> Fatima</w:t>
+        <w:t>wish Fatima</w:t>
       </w:r>
     </w:p>
     <w:p>
@@ -482,21 +478,7 @@
         <w:rPr>
           <w:rFonts w:ascii="Times New Roman" w:hAnsi="Times New Roman" w:cs="Times New Roman"/>
         </w:rPr>
-        <w:t xml:space="preserve">The objective of this experiment was to compare the computational efficiency and environmental impact of different Large Language Models (LLMs) during inference. The experiments focused on measuring execution time, GPU utilization, estimated energy consumption, and carbon emissions using </w:t>
-      </w:r>
-      <w:proofErr w:type="spellStart"/>
-      <w:r>
-        <w:rPr>
-          <w:rFonts w:ascii="Times New Roman" w:hAnsi="Times New Roman" w:cs="Times New Roman"/>
-        </w:rPr>
-        <w:t>CodeCarbon</w:t>
-      </w:r>
-      <w:proofErr w:type="spellEnd"/>
-      <w:r>
-        <w:rPr>
-          <w:rFonts w:ascii="Times New Roman" w:hAnsi="Times New Roman" w:cs="Times New Roman"/>
-        </w:rPr>
-        <w:t xml:space="preserve">. </w:t>
+        <w:t xml:space="preserve">The objective of this experiment was to compare the computational efficiency and environmental impact of different Large Language Models (LLMs) during inference. The experiments focused on measuring execution time, GPU utilization, estimated energy consumption, and carbon emissions using CodeCarbon. </w:t>
       </w:r>
       <w:r>
         <w:rPr>
@@ -623,21 +605,7 @@
         <w:rPr>
           <w:rFonts w:ascii="Times New Roman" w:hAnsi="Times New Roman" w:cs="Times New Roman"/>
         </w:rPr>
-        <w:t xml:space="preserve">Deep Learning Library: </w:t>
-      </w:r>
-      <w:proofErr w:type="spellStart"/>
-      <w:r>
-        <w:rPr>
-          <w:rFonts w:ascii="Times New Roman" w:hAnsi="Times New Roman" w:cs="Times New Roman"/>
-        </w:rPr>
-        <w:t>PyTorch</w:t>
-      </w:r>
-      <w:proofErr w:type="spellEnd"/>
-      <w:r>
-        <w:rPr>
-          <w:rFonts w:ascii="Times New Roman" w:hAnsi="Times New Roman" w:cs="Times New Roman"/>
-        </w:rPr>
-        <w:t xml:space="preserve"> </w:t>
+        <w:t xml:space="preserve">Deep Learning Library: PyTorch </w:t>
       </w:r>
     </w:p>
     <w:p>
@@ -654,21 +622,7 @@
         <w:rPr>
           <w:rFonts w:ascii="Times New Roman" w:hAnsi="Times New Roman" w:cs="Times New Roman"/>
         </w:rPr>
-        <w:t xml:space="preserve">Carbon Measurement Tool: </w:t>
-      </w:r>
-      <w:proofErr w:type="spellStart"/>
-      <w:r>
-        <w:rPr>
-          <w:rFonts w:ascii="Times New Roman" w:hAnsi="Times New Roman" w:cs="Times New Roman"/>
-        </w:rPr>
-        <w:t>CodeCarbon</w:t>
-      </w:r>
-      <w:proofErr w:type="spellEnd"/>
-      <w:r>
-        <w:rPr>
-          <w:rFonts w:ascii="Times New Roman" w:hAnsi="Times New Roman" w:cs="Times New Roman"/>
-        </w:rPr>
-        <w:t xml:space="preserve"> </w:t>
+        <w:t xml:space="preserve">Carbon Measurement Tool: CodeCarbon </w:t>
       </w:r>
     </w:p>
     <w:p>
@@ -817,13 +771,7 @@
         <w:rPr>
           <w:rFonts w:ascii="Times New Roman" w:hAnsi="Times New Roman" w:cs="Times New Roman"/>
         </w:rPr>
-        <w:t>Mistral-7B-Instruct-v0.</w:t>
-      </w:r>
-      <w:r>
-        <w:rPr>
-          <w:rFonts w:ascii="Times New Roman" w:hAnsi="Times New Roman" w:cs="Times New Roman"/>
-        </w:rPr>
-        <w:t>3</w:t>
+        <w:t>Mistral-7B-Instruct-v0.3</w:t>
       </w:r>
     </w:p>
     <w:p>
@@ -2136,35 +2084,7 @@
         <w:rPr>
           <w:rFonts w:ascii="Times New Roman" w:hAnsi="Times New Roman" w:cs="Times New Roman"/>
         </w:rPr>
-        <w:t xml:space="preserve">Qwen2.5-1.5B-Instruct exhibited computational requirements between </w:t>
-      </w:r>
-      <w:proofErr w:type="spellStart"/>
-      <w:r>
-        <w:rPr>
-          <w:rFonts w:ascii="Times New Roman" w:hAnsi="Times New Roman" w:cs="Times New Roman"/>
-        </w:rPr>
-        <w:t>TinyLlama</w:t>
-      </w:r>
-      <w:proofErr w:type="spellEnd"/>
-      <w:r>
-        <w:rPr>
-          <w:rFonts w:ascii="Times New Roman" w:hAnsi="Times New Roman" w:cs="Times New Roman"/>
-        </w:rPr>
-        <w:t xml:space="preserve"> and Mistral. While providing stronger language capabilities than smaller models, it required additional computational resources, resulting in increased runtime and carbon emissions compared with </w:t>
-      </w:r>
-      <w:proofErr w:type="spellStart"/>
-      <w:r>
-        <w:rPr>
-          <w:rFonts w:ascii="Times New Roman" w:hAnsi="Times New Roman" w:cs="Times New Roman"/>
-        </w:rPr>
-        <w:t>TinyLlama</w:t>
-      </w:r>
-      <w:proofErr w:type="spellEnd"/>
-      <w:r>
-        <w:rPr>
-          <w:rFonts w:ascii="Times New Roman" w:hAnsi="Times New Roman" w:cs="Times New Roman"/>
-        </w:rPr>
-        <w:t>.</w:t>
+        <w:t>Qwen2.5-1.5B-Instruct exhibited computational requirements between TinyLlama and Mistral. While providing stronger language capabilities than smaller models, it required additional computational resources, resulting in increased runtime and carbon emissions compared with TinyLlama.</w:t>
       </w:r>
     </w:p>
     <w:p>
@@ -2371,21 +2291,7 @@
         <w:rPr>
           <w:rFonts w:ascii="Times New Roman" w:hAnsi="Times New Roman" w:cs="Times New Roman"/>
         </w:rPr>
-        <w:t xml:space="preserve">This study compared the energy consumption and carbon emissions of six transformer-based language models using a consistent experimental setup and </w:t>
-      </w:r>
-      <w:proofErr w:type="spellStart"/>
-      <w:r>
-        <w:rPr>
-          <w:rFonts w:ascii="Times New Roman" w:hAnsi="Times New Roman" w:cs="Times New Roman"/>
-        </w:rPr>
-        <w:t>CodeCarbon</w:t>
-      </w:r>
-      <w:proofErr w:type="spellEnd"/>
-      <w:r>
-        <w:rPr>
-          <w:rFonts w:ascii="Times New Roman" w:hAnsi="Times New Roman" w:cs="Times New Roman"/>
-        </w:rPr>
-        <w:t xml:space="preserve"> for environmental impact measurement. The results demonstrate that computational complexity, runtime, and carbon emissions generally increase with model size and computational workload.</w:t>
+        <w:t>This study compared the energy consumption and carbon emissions of six transformer-based language models using a consistent experimental setup and CodeCarbon for environmental impact measurement. The results demonstrate that computational complexity, runtime, and carbon emissions generally increase with model size and computational workload.</w:t>
       </w:r>
     </w:p>
     <w:p>
@@ -2411,21 +2317,7 @@
         <w:rPr>
           <w:rFonts w:ascii="Times New Roman" w:hAnsi="Times New Roman" w:cs="Times New Roman"/>
         </w:rPr>
-        <w:t xml:space="preserve">These findings highlight the importance of selecting efficient language models for environmentally sustainable AI deployment. Measuring runtime, energy consumption, and carbon emissions using tools such as </w:t>
-      </w:r>
-      <w:proofErr w:type="spellStart"/>
-      <w:r>
-        <w:rPr>
-          <w:rFonts w:ascii="Times New Roman" w:hAnsi="Times New Roman" w:cs="Times New Roman"/>
-        </w:rPr>
-        <w:t>CodeCarbon</w:t>
-      </w:r>
-      <w:proofErr w:type="spellEnd"/>
-      <w:r>
-        <w:rPr>
-          <w:rFonts w:ascii="Times New Roman" w:hAnsi="Times New Roman" w:cs="Times New Roman"/>
-        </w:rPr>
-        <w:t xml:space="preserve"> provides valuable insights for designing and deploying more energy-efficient Generative AI systems.</w:t>
+        <w:t>These findings highlight the importance of selecting efficient language models for environmentally sustainable AI deployment. Measuring runtime, energy consumption, and carbon emissions using tools such as CodeCarbon provides valuable insights for designing and deploying more energy-efficient Generative AI systems.</w:t>
       </w:r>
     </w:p>
     <w:sectPr>
@@ -3502,6 +3394,7 @@
   <w:style w:type="character" w:default="1" w:styleId="DefaultParagraphFont">
     <w:name w:val="Default Paragraph Font"/>
     <w:uiPriority w:val="1"/>
+    <w:semiHidden/>
     <w:unhideWhenUsed/>
   </w:style>
   <w:style w:type="table" w:default="1" w:styleId="TableNormal">

</xml_diff>